<commit_message>
QA fix: resume overclaimed review response, only generation is confirmed
Double-checked both documents line by line against master-profile.md.
The resume's competencies listed "Review Response & Generation," but
only automated review-generation sequences (soliciting new reviews) are
confirmed for Josh's Solenzo work — responding to existing reviews isn't
documented anywhere, and that's the JD's first listed responsibility.
Corrected the competency line and the Birdeye bullet's matching phrase,
and added it to the match report as the single highest-value candidate
confirmation on this posting. Cover letter had no equivalent claim and
needed no change.

Co-Authored-By: Claude Sonnet 5 <noreply@anthropic.com>
Claude-Session: https://claude.ai/code/session_01VueqVs3VuXe3kjn1NdkX4A
</commit_message>
<xml_diff>
--- a/applications/atlus-pest-solutions-customer-support-marketing-assistant/Atlus-CustomerSupportMarketingAssistant-Resume.docx
+++ b/applications/atlus-pest-solutions-customer-support-marketing-assistant/Atlus-CustomerSupportMarketingAssistant-Resume.docx
@@ -381,7 +381,7 @@
           <w:i w:val="0"/>
           <w:color w:val="1A1A1A"/>
         </w:rPr>
-        <w:t>Sold and onboarded partners on Birdeye's proprietary reputation-management and local-listings/data-aggregator platform, ensuring every partner's end customer had accurate business listings and an active review-management program.</w:t>
+        <w:t>Sold and onboarded partners on Birdeye's proprietary reputation-management and local-listings/data-aggregator platform, ensuring every partner's end customer had accurate business listings and an active reputation-management program.</w:t>
       </w:r>
     </w:p>
     <w:p>
@@ -572,7 +572,7 @@
           <w:i w:val="0"/>
           <w:color w:val="1A1A1A"/>
         </w:rPr>
-        <w:t>Google Business Profile Management, Review Response &amp; Generation, Local Listings / Data-Aggregator Platforms</w:t>
+        <w:t>Google Business Profile Management, Review Generation, Local Listings / Data-Aggregator Platforms</w:t>
       </w:r>
     </w:p>
     <w:p>

</xml_diff>